<commit_message>
Insert assigned Zenodo DOI 10.5281/zenodo.21492082 into Code Availability
Replaces the placeholder DOI with the reserved Zenodo record DOI in the paper
(v5 green / v4), the Response to Editor, and all rebuilt DOCX/PDF artifacts.

Co-Authored-By: Claude Opus 4.8 <noreply@anthropic.com>
</commit_message>
<xml_diff>
--- a/editor_response.docx
+++ b/editor_response.docx
@@ -412,7 +412,21 @@
           <w:b w:val="0"/>
           <w:i w:val="0"/>
         </w:rPr>
-        <w:t>, which assigns a permanent DOI, in addition to the GitHub development repository. The Code Availability section links both.</w:t>
+        <w:t>, which assigns a permanent DOI (</w:t>
+      </w:r>
+      <w:r>
+        <w:rPr>
+          <w:b/>
+          <w:i w:val="0"/>
+        </w:rPr>
+        <w:t>https://doi.org/10.5281/zenodo.21492082</w:t>
+      </w:r>
+      <w:r>
+        <w:rPr>
+          <w:b w:val="0"/>
+          <w:i w:val="0"/>
+        </w:rPr>
+        <w:t>), in addition to the GitHub development repository. The Code Availability section links both.</w:t>
       </w:r>
     </w:p>
     <w:p>
@@ -434,15 +448,7 @@
           <w:i w:val="0"/>
           <w:sz w:val="19"/>
         </w:rPr>
-        <w:t xml:space="preserve"> Code Availability Statement (GitHub repository plus the Zenodo DOI). </w:t>
-      </w:r>
-      <w:r>
-        <w:rPr>
-          <w:b w:val="0"/>
-          <w:i w:val="0"/>
-          <w:sz w:val="19"/>
-        </w:rPr>
-        <w:t>Author note: create the Zenodo deposit (e.g. via the GitHub-Zenodo release integration) and replace the placeholder DOI 10.5281/zenodo.XXXXXXX with the assigned DOI before final submission.</w:t>
+        <w:t xml:space="preserve"> Code Availability Statement (GitHub repository plus the Zenodo DOI 10.5281/zenodo.21492082).</w:t>
       </w:r>
     </w:p>
     <w:p>

</xml_diff>

<commit_message>
Precise DUA wording (accessing authors) + strengthen citation response
- Paper (v5 green / v4) and editor response now state that the author(s) who
  ACCESSED MIMIC-CXR are credentialed and signed the DUA (not all co-authors),
  matching PhysioNet per-individual credentialing.
- Editor response section 2 now explains the MIMIC-CXR-JPG v2.1.0 citation follows
  the resource's own required-citation guidance, retains Sci Data + Goldberger as
  requested, and offers the base MIMIC-CXR Database v2.1.0 DOI (10.13026/4jqj-jw95)
  if the editor prefers it. All four dataset DOIs independently verified.

Co-Authored-By: Claude Opus 4.8 <noreply@anthropic.com>
</commit_message>
<xml_diff>
--- a/editor_response.docx
+++ b/editor_response.docx
@@ -239,7 +239,49 @@
           <w:b w:val="0"/>
           <w:i w:val="0"/>
         </w:rPr>
-        <w:t>We cite the exact 2.1.0 resource rather than the older 2.0.0 entry so that the citation matches the version we used; the original-publication and PhysioNet citations are version-independent and are the ones requested.</w:t>
+        <w:t xml:space="preserve">Because our images come from the JPG release, we cite the exact resource for the version used, </w:t>
+      </w:r>
+      <w:r>
+        <w:rPr>
+          <w:b/>
+          <w:i w:val="0"/>
+        </w:rPr>
+        <w:t>MIMIC-CXR-JPG v2.1.0</w:t>
+      </w:r>
+      <w:r>
+        <w:rPr>
+          <w:b w:val="0"/>
+          <w:i w:val="0"/>
+        </w:rPr>
+        <w:t xml:space="preserve"> (https://doi.org/10.13026/jsn5-t979), which is the dataset citation that the version-2.1.0 resource's own "When using this resource, please cite" guidance specifies in place of the older 2.0.0 database entry. We retain the original MIMIC-CXR publication (Johnson et al., </w:t>
+      </w:r>
+      <w:r>
+        <w:rPr>
+          <w:b w:val="0"/>
+          <w:i/>
+        </w:rPr>
+        <w:t>Scientific Data</w:t>
+      </w:r>
+      <w:r>
+        <w:rPr>
+          <w:b w:val="0"/>
+          <w:i w:val="0"/>
+        </w:rPr>
+        <w:t xml:space="preserve"> 6, 317, 2019) and the PhysioNet platform citation (Goldberger et al., </w:t>
+      </w:r>
+      <w:r>
+        <w:rPr>
+          <w:b w:val="0"/>
+          <w:i/>
+        </w:rPr>
+        <w:t>Circulation</w:t>
+      </w:r>
+      <w:r>
+        <w:rPr>
+          <w:b w:val="0"/>
+          <w:i w:val="0"/>
+        </w:rPr>
+        <w:t>, 2000) exactly as requested. Should the editor prefer that we additionally cite the base MIMIC-CXR Database at version 2.1.0, it is available at https://doi.org/10.13026/4jqj-jw95 and we are happy to add it.</w:t>
       </w:r>
     </w:p>
     <w:p>
@@ -300,7 +342,7 @@
           <w:b w:val="0"/>
           <w:i w:val="0"/>
         </w:rPr>
-        <w:t xml:space="preserve">We confirm that the authors are credentialed PhysioNet users, completed the required human-subjects (CITI "Data or Specimens Only Research") training, and </w:t>
+        <w:t xml:space="preserve">We confirm that the author(s) who accessed MIMIC-CXR are credentialed PhysioNet users, completed the required human-subjects (CITI "Data or Specimens Only Research") training, and </w:t>
       </w:r>
       <w:r>
         <w:rPr>
@@ -314,7 +356,7 @@
           <w:b w:val="0"/>
           <w:i w:val="0"/>
         </w:rPr>
-        <w:t xml:space="preserve"> for MIMIC-CXR, and that the data were used solely in accordance with its terms. We now state this explicitly in the manuscript.</w:t>
+        <w:t xml:space="preserve"> for MIMIC-CXR, and that the data were used solely in accordance with its terms. Co-authors who did not access the restricted images did not require separate credentialing. We now state this explicitly in the manuscript.</w:t>
       </w:r>
     </w:p>
     <w:p>

</xml_diff>

<commit_message>
Point paper to Zenodo concept DOI (10.5281/zenodo.21492081)
Published a cleaned Zenodo version (v1.1.0, code+data only; dropped paper drafts,
peer-review materials, planning/registry prose). Switched the manuscript, clean
manuscript, marked-up copy, and editor response from the v1 version DOI to the
concept (all-versions) DOI, which always resolves to the latest clean version.
New version DOI: 10.5281/zenodo.21492760.

Co-Authored-By: Claude Opus 4.8 <noreply@anthropic.com>
</commit_message>
<xml_diff>
--- a/editor_response.docx
+++ b/editor_response.docx
@@ -461,7 +461,7 @@
           <w:b/>
           <w:i w:val="0"/>
         </w:rPr>
-        <w:t>https://doi.org/10.5281/zenodo.21492082</w:t>
+        <w:t>https://doi.org/10.5281/zenodo.21492081</w:t>
       </w:r>
       <w:r>
         <w:rPr>
@@ -490,7 +490,7 @@
           <w:i w:val="0"/>
           <w:sz w:val="19"/>
         </w:rPr>
-        <w:t xml:space="preserve"> Code Availability Statement (GitHub repository plus the Zenodo DOI 10.5281/zenodo.21492082).</w:t>
+        <w:t xml:space="preserve"> Code Availability Statement (GitHub repository plus the Zenodo DOI 10.5281/zenodo.21492081).</w:t>
       </w:r>
     </w:p>
     <w:p>

</xml_diff>